<commit_message>
Add Google Sheets integrations, exports & OAuth
</commit_message>
<xml_diff>
--- a/backend/resources/docx-templates/kltn-gvhd-rubric-template.docx
+++ b/backend/resources/docx-templates/kltn-gvhd-rubric-template.docx
@@ -150,61 +150,35 @@
           <w:rFonts w:cs="Times New Roman"/>
           <w:lang w:bidi="ar-SA"/>
         </w:rPr>
-        <w:t>Sinh viên thực hiện: .....................................................................................</w:t>
+        <w:t xml:space="preserve">Sinh viên thực hiện: </w:t>
       </w:r>
       <w:r>
         <w:rPr>
           <w:rFonts w:cs="Times New Roman"/>
           <w:lang w:bidi="ar-SA"/>
         </w:rPr>
-        <w:t>..........</w:t>
+        <w:t>{{studentName}}</w:t>
       </w:r>
       <w:r>
         <w:rPr>
           <w:rFonts w:cs="Times New Roman"/>
           <w:lang w:bidi="ar-SA"/>
         </w:rPr>
-        <w:t>MSSV:  .................................................</w:t>
+        <w:t xml:space="preserve"> </w:t>
       </w:r>
       <w:r>
         <w:rPr>
           <w:rFonts w:cs="Times New Roman"/>
           <w:lang w:bidi="ar-SA"/>
         </w:rPr>
-        <w:t>...........................</w:t>
-      </w:r>
-    </w:p>
-    <w:p>
-      <w:pPr>
-        <w:tabs>
-          <w:tab w:val="right" w:leader="dot" w:pos="12900"/>
-        </w:tabs>
-        <w:spacing w:before="100" w:beforeAutospacing="1" w:after="100" w:afterAutospacing="1"/>
-        <w:rPr>
-          <w:rFonts w:cs="Times New Roman"/>
-          <w:lang w:bidi="ar-SA"/>
-        </w:rPr>
-      </w:pPr>
-      <w:r>
-        <w:rPr>
-          <w:rFonts w:cs="Times New Roman"/>
-          <w:lang w:bidi="ar-SA"/>
-        </w:rPr>
-        <w:t>Tên KLTN</w:t>
+        <w:t>MSSV:  </w:t>
       </w:r>
       <w:r>
         <w:rPr>
           <w:rFonts w:cs="Times New Roman"/>
           <w:lang w:bidi="ar-SA"/>
         </w:rPr>
-        <w:t>:  </w:t>
-      </w:r>
-      <w:r>
-        <w:rPr>
-          <w:rFonts w:cs="Times New Roman"/>
-          <w:lang w:bidi="ar-SA"/>
-        </w:rPr>
-        <w:t>......................................................................................................................................................................................................</w:t>
+        <w:t>{{studentId}}</w:t>
       </w:r>
     </w:p>
     <w:p>
@@ -223,7 +197,21 @@
           <w:rFonts w:cs="Times New Roman"/>
           <w:lang w:bidi="ar-SA"/>
         </w:rPr>
-        <w:t>...........................................................................................................................................................................................................................</w:t>
+        <w:t>Tên KLTN</w:t>
+      </w:r>
+      <w:r>
+        <w:rPr>
+          <w:rFonts w:cs="Times New Roman"/>
+          <w:lang w:bidi="ar-SA"/>
+        </w:rPr>
+        <w:t>:  </w:t>
+      </w:r>
+      <w:r>
+        <w:rPr>
+          <w:rFonts w:cs="Times New Roman"/>
+          <w:lang w:bidi="ar-SA"/>
+        </w:rPr>
+        <w:t>{{topicTitle}}</w:t>
       </w:r>
     </w:p>
     <w:tbl>
@@ -240,12 +228,12 @@
         <w:tblLook w:val="0000" w:firstRow="0" w:lastRow="0" w:firstColumn="0" w:lastColumn="0" w:noHBand="0" w:noVBand="0"/>
       </w:tblPr>
       <w:tblGrid>
-        <w:gridCol w:w="2093"/>
-        <w:gridCol w:w="2551"/>
-        <w:gridCol w:w="2410"/>
-        <w:gridCol w:w="2552"/>
-        <w:gridCol w:w="2551"/>
-        <w:gridCol w:w="1459"/>
+        <w:gridCol w:w="1971"/>
+        <w:gridCol w:w="2393"/>
+        <w:gridCol w:w="2265"/>
+        <w:gridCol w:w="2397"/>
+        <w:gridCol w:w="2393"/>
+        <w:gridCol w:w="2197"/>
       </w:tblGrid>
       <w:tr>
         <w:trPr>
@@ -532,6 +520,14 @@
                 <w:rFonts w:cs="Times New Roman"/>
               </w:rPr>
             </w:pPr>
+            <w:r>
+              <w:rPr>
+                <w:rFonts w:cs="Times New Roman"/>
+                <w:b/>
+                <w:bCs/>
+              </w:rPr>
+              <w:t>{{diem1}}</w:t>
+            </w:r>
           </w:p>
         </w:tc>
       </w:tr>
@@ -839,6 +835,36 @@
                 <w:szCs w:val="20"/>
               </w:rPr>
             </w:pPr>
+            <w:r>
+              <w:rPr>
+                <w:rFonts w:cs="Times New Roman"/>
+                <w:b/>
+                <w:bCs/>
+                <w:sz w:val="20"/>
+                <w:szCs w:val="20"/>
+              </w:rPr>
+              <w:t>{{diem</w:t>
+            </w:r>
+            <w:r>
+              <w:rPr>
+                <w:rFonts w:cs="Times New Roman"/>
+                <w:b/>
+                <w:bCs/>
+                <w:sz w:val="20"/>
+                <w:szCs w:val="20"/>
+              </w:rPr>
+              <w:t>2</w:t>
+            </w:r>
+            <w:r>
+              <w:rPr>
+                <w:rFonts w:cs="Times New Roman"/>
+                <w:b/>
+                <w:bCs/>
+                <w:sz w:val="20"/>
+                <w:szCs w:val="20"/>
+              </w:rPr>
+              <w:t>}}</w:t>
+            </w:r>
           </w:p>
         </w:tc>
       </w:tr>
@@ -1138,6 +1164,36 @@
                 <w:szCs w:val="20"/>
               </w:rPr>
             </w:pPr>
+            <w:r>
+              <w:rPr>
+                <w:rFonts w:cs="Times New Roman"/>
+                <w:b/>
+                <w:bCs/>
+                <w:sz w:val="20"/>
+                <w:szCs w:val="20"/>
+              </w:rPr>
+              <w:t>{{diem</w:t>
+            </w:r>
+            <w:r>
+              <w:rPr>
+                <w:rFonts w:cs="Times New Roman"/>
+                <w:b/>
+                <w:bCs/>
+                <w:sz w:val="20"/>
+                <w:szCs w:val="20"/>
+              </w:rPr>
+              <w:t>3</w:t>
+            </w:r>
+            <w:r>
+              <w:rPr>
+                <w:rFonts w:cs="Times New Roman"/>
+                <w:b/>
+                <w:bCs/>
+                <w:sz w:val="20"/>
+                <w:szCs w:val="20"/>
+              </w:rPr>
+              <w:t>}}</w:t>
+            </w:r>
           </w:p>
         </w:tc>
       </w:tr>
@@ -1557,6 +1613,36 @@
                 <w:szCs w:val="20"/>
               </w:rPr>
             </w:pPr>
+            <w:r>
+              <w:rPr>
+                <w:rFonts w:cs="Times New Roman"/>
+                <w:b/>
+                <w:bCs/>
+                <w:sz w:val="20"/>
+                <w:szCs w:val="20"/>
+              </w:rPr>
+              <w:t>{{diem</w:t>
+            </w:r>
+            <w:r>
+              <w:rPr>
+                <w:rFonts w:cs="Times New Roman"/>
+                <w:b/>
+                <w:bCs/>
+                <w:sz w:val="20"/>
+                <w:szCs w:val="20"/>
+              </w:rPr>
+              <w:t>4</w:t>
+            </w:r>
+            <w:r>
+              <w:rPr>
+                <w:rFonts w:cs="Times New Roman"/>
+                <w:b/>
+                <w:bCs/>
+                <w:sz w:val="20"/>
+                <w:szCs w:val="20"/>
+              </w:rPr>
+              <w:t>}}</w:t>
+            </w:r>
           </w:p>
         </w:tc>
       </w:tr>
@@ -1830,6 +1916,12 @@
                 <w:rFonts w:cs="Times New Roman"/>
               </w:rPr>
             </w:pPr>
+            <w:r>
+              <w:rPr>
+                <w:rFonts w:cs="Times New Roman"/>
+              </w:rPr>
+              <w:t>{{totalScoreFixed}}</w:t>
+            </w:r>
           </w:p>
         </w:tc>
       </w:tr>
@@ -1878,21 +1970,21 @@
           <w:rFonts w:cs="Times New Roman"/>
           <w:lang w:bidi="ar-SA"/>
         </w:rPr>
-        <w:sym w:font="Wingdings" w:char="F0A8"/>
+        <w:t>{{cho_bao_ve_mark}}</w:t>
       </w:r>
       <w:r>
         <w:rPr>
           <w:rFonts w:cs="Times New Roman"/>
           <w:lang w:bidi="ar-SA"/>
         </w:rPr>
-        <w:t xml:space="preserve"> Cho SV bảo vệ trước hội đồng            </w:t>
+        <w:t xml:space="preserve"> Cho SV bảo vệ trước hội đồng         </w:t>
       </w:r>
       <w:r>
         <w:rPr>
           <w:rFonts w:cs="Times New Roman"/>
           <w:lang w:bidi="ar-SA"/>
         </w:rPr>
-        <w:sym w:font="Wingdings" w:char="F0A8"/>
+        <w:t>{{khong_bao_ve_mark}}</w:t>
       </w:r>
       <w:r>
         <w:rPr>
@@ -1915,7 +2007,7 @@
     <w:p>
       <w:pPr>
         <w:spacing w:before="100" w:beforeAutospacing="1" w:after="100" w:afterAutospacing="1"/>
-        <w:ind w:left="9720" w:firstLine="360"/>
+        <w:ind w:left="7920" w:firstLine="720"/>
         <w:rPr>
           <w:rFonts w:cs="Times New Roman"/>
           <w:lang w:bidi="ar-SA"/>
@@ -1926,7 +2018,7 @@
           <w:rFonts w:cs="Times New Roman"/>
           <w:lang w:bidi="ar-SA"/>
         </w:rPr>
-        <w:t>Ngày ….tháng…..năm ……</w:t>
+        <w:t>Ngày {{ngay}} tháng {{thang}} năm {{nam}}</w:t>
       </w:r>
     </w:p>
     <w:p>
@@ -2339,6 +2431,50 @@
     <w:lsdException w:name="Subtitle" w:qFormat="1"/>
     <w:lsdException w:name="Strong" w:qFormat="1"/>
     <w:lsdException w:name="Emphasis" w:qFormat="1"/>
+    <w:lsdException w:name="Normal Table" w:semiHidden="1" w:unhideWhenUsed="1"/>
+    <w:lsdException w:name="Table Simple 1" w:semiHidden="1" w:unhideWhenUsed="1"/>
+    <w:lsdException w:name="Table Simple 2" w:semiHidden="1" w:unhideWhenUsed="1"/>
+    <w:lsdException w:name="Table Simple 3" w:semiHidden="1" w:unhideWhenUsed="1"/>
+    <w:lsdException w:name="Table Classic 1" w:semiHidden="1" w:unhideWhenUsed="1"/>
+    <w:lsdException w:name="Table Classic 2" w:semiHidden="1" w:unhideWhenUsed="1"/>
+    <w:lsdException w:name="Table Classic 3" w:semiHidden="1" w:unhideWhenUsed="1"/>
+    <w:lsdException w:name="Table Classic 4" w:semiHidden="1" w:unhideWhenUsed="1"/>
+    <w:lsdException w:name="Table Colorful 1" w:semiHidden="1" w:unhideWhenUsed="1"/>
+    <w:lsdException w:name="Table Colorful 2" w:semiHidden="1" w:unhideWhenUsed="1"/>
+    <w:lsdException w:name="Table Colorful 3" w:semiHidden="1" w:unhideWhenUsed="1"/>
+    <w:lsdException w:name="Table Columns 1" w:semiHidden="1" w:unhideWhenUsed="1"/>
+    <w:lsdException w:name="Table Columns 2" w:semiHidden="1" w:unhideWhenUsed="1"/>
+    <w:lsdException w:name="Table Columns 3" w:semiHidden="1" w:unhideWhenUsed="1"/>
+    <w:lsdException w:name="Table Columns 4" w:semiHidden="1" w:unhideWhenUsed="1"/>
+    <w:lsdException w:name="Table Columns 5" w:semiHidden="1" w:unhideWhenUsed="1"/>
+    <w:lsdException w:name="Table Grid 1" w:semiHidden="1" w:unhideWhenUsed="1"/>
+    <w:lsdException w:name="Table Grid 2" w:semiHidden="1" w:unhideWhenUsed="1"/>
+    <w:lsdException w:name="Table Grid 3" w:semiHidden="1" w:unhideWhenUsed="1"/>
+    <w:lsdException w:name="Table Grid 4" w:semiHidden="1" w:unhideWhenUsed="1"/>
+    <w:lsdException w:name="Table Grid 5" w:semiHidden="1" w:unhideWhenUsed="1"/>
+    <w:lsdException w:name="Table Grid 6" w:semiHidden="1" w:unhideWhenUsed="1"/>
+    <w:lsdException w:name="Table Grid 7" w:semiHidden="1" w:unhideWhenUsed="1"/>
+    <w:lsdException w:name="Table Grid 8" w:semiHidden="1" w:unhideWhenUsed="1"/>
+    <w:lsdException w:name="Table List 1" w:semiHidden="1" w:unhideWhenUsed="1"/>
+    <w:lsdException w:name="Table List 2" w:semiHidden="1" w:unhideWhenUsed="1"/>
+    <w:lsdException w:name="Table List 3" w:semiHidden="1" w:unhideWhenUsed="1"/>
+    <w:lsdException w:name="Table List 4" w:semiHidden="1" w:unhideWhenUsed="1"/>
+    <w:lsdException w:name="Table List 5" w:semiHidden="1" w:unhideWhenUsed="1"/>
+    <w:lsdException w:name="Table List 6" w:semiHidden="1" w:unhideWhenUsed="1"/>
+    <w:lsdException w:name="Table List 7" w:semiHidden="1" w:unhideWhenUsed="1"/>
+    <w:lsdException w:name="Table List 8" w:semiHidden="1" w:unhideWhenUsed="1"/>
+    <w:lsdException w:name="Table 3D effects 1" w:semiHidden="1" w:unhideWhenUsed="1"/>
+    <w:lsdException w:name="Table 3D effects 2" w:semiHidden="1" w:unhideWhenUsed="1"/>
+    <w:lsdException w:name="Table 3D effects 3" w:semiHidden="1" w:unhideWhenUsed="1"/>
+    <w:lsdException w:name="Table Contemporary" w:semiHidden="1" w:unhideWhenUsed="1"/>
+    <w:lsdException w:name="Table Elegant" w:semiHidden="1" w:unhideWhenUsed="1"/>
+    <w:lsdException w:name="Table Professional" w:semiHidden="1" w:unhideWhenUsed="1"/>
+    <w:lsdException w:name="Table Subtle 1" w:semiHidden="1" w:unhideWhenUsed="1"/>
+    <w:lsdException w:name="Table Subtle 2" w:semiHidden="1" w:unhideWhenUsed="1"/>
+    <w:lsdException w:name="Table Web 1" w:semiHidden="1" w:unhideWhenUsed="1"/>
+    <w:lsdException w:name="Table Web 2" w:semiHidden="1" w:unhideWhenUsed="1"/>
+    <w:lsdException w:name="Table Web 3" w:semiHidden="1" w:unhideWhenUsed="1"/>
+    <w:lsdException w:name="Table Theme" w:semiHidden="1" w:unhideWhenUsed="1"/>
     <w:lsdException w:name="Placeholder Text" w:semiHidden="1" w:uiPriority="99"/>
     <w:lsdException w:name="No Spacing" w:uiPriority="1" w:qFormat="1"/>
     <w:lsdException w:name="Light Shading" w:uiPriority="60"/>
@@ -2572,11 +2708,14 @@
   </w:style>
   <w:style w:type="character" w:default="1" w:styleId="DefaultParagraphFont">
     <w:name w:val="Default Paragraph Font"/>
-    <w:semiHidden/>
+    <w:uiPriority w:val="1"/>
+    <w:unhideWhenUsed/>
   </w:style>
   <w:style w:type="table" w:default="1" w:styleId="TableNormal">
     <w:name w:val="Normal Table"/>
+    <w:uiPriority w:val="99"/>
     <w:semiHidden/>
+    <w:unhideWhenUsed/>
     <w:tblPr>
       <w:tblInd w:w="0" w:type="dxa"/>
       <w:tblCellMar>
@@ -2589,7 +2728,9 @@
   </w:style>
   <w:style w:type="numbering" w:default="1" w:styleId="NoList">
     <w:name w:val="No List"/>
+    <w:uiPriority w:val="99"/>
     <w:semiHidden/>
+    <w:unhideWhenUsed/>
   </w:style>
   <w:style w:type="table" w:styleId="TableGrid">
     <w:name w:val="Table Grid"/>

</xml_diff>

<commit_message>
fix: align topic workflow contracts for production validation
</commit_message>
<xml_diff>
--- a/backend/resources/docx-templates/kltn-gvhd-rubric-template.docx
+++ b/backend/resources/docx-templates/kltn-gvhd-rubric-template.docx
@@ -150,35 +150,61 @@
           <w:rFonts w:cs="Times New Roman"/>
           <w:lang w:bidi="ar-SA"/>
         </w:rPr>
-        <w:t xml:space="preserve">Sinh viên thực hiện: </w:t>
+        <w:t>Sinh viên thực hiện: .....................................................................................</w:t>
       </w:r>
       <w:r>
         <w:rPr>
           <w:rFonts w:cs="Times New Roman"/>
           <w:lang w:bidi="ar-SA"/>
         </w:rPr>
-        <w:t>{{studentName}}</w:t>
+        <w:t>..........</w:t>
       </w:r>
       <w:r>
         <w:rPr>
           <w:rFonts w:cs="Times New Roman"/>
           <w:lang w:bidi="ar-SA"/>
         </w:rPr>
-        <w:t xml:space="preserve"> </w:t>
+        <w:t>MSSV:  .................................................</w:t>
       </w:r>
       <w:r>
         <w:rPr>
           <w:rFonts w:cs="Times New Roman"/>
           <w:lang w:bidi="ar-SA"/>
         </w:rPr>
-        <w:t>MSSV:  </w:t>
+        <w:t>...........................</w:t>
+      </w:r>
+    </w:p>
+    <w:p>
+      <w:pPr>
+        <w:tabs>
+          <w:tab w:val="right" w:leader="dot" w:pos="12900"/>
+        </w:tabs>
+        <w:spacing w:before="100" w:beforeAutospacing="1" w:after="100" w:afterAutospacing="1"/>
+        <w:rPr>
+          <w:rFonts w:cs="Times New Roman"/>
+          <w:lang w:bidi="ar-SA"/>
+        </w:rPr>
+      </w:pPr>
+      <w:r>
+        <w:rPr>
+          <w:rFonts w:cs="Times New Roman"/>
+          <w:lang w:bidi="ar-SA"/>
+        </w:rPr>
+        <w:t>Tên KLTN</w:t>
       </w:r>
       <w:r>
         <w:rPr>
           <w:rFonts w:cs="Times New Roman"/>
           <w:lang w:bidi="ar-SA"/>
         </w:rPr>
-        <w:t>{{studentId}}</w:t>
+        <w:t>:  </w:t>
+      </w:r>
+      <w:r>
+        <w:rPr>
+          <w:rFonts w:cs="Times New Roman"/>
+          <w:lang w:bidi="ar-SA"/>
+        </w:rPr>
+        <w:t>......................................................................................................................................................................................................</w:t>
       </w:r>
     </w:p>
     <w:p>
@@ -197,21 +223,7 @@
           <w:rFonts w:cs="Times New Roman"/>
           <w:lang w:bidi="ar-SA"/>
         </w:rPr>
-        <w:t>Tên KLTN</w:t>
-      </w:r>
-      <w:r>
-        <w:rPr>
-          <w:rFonts w:cs="Times New Roman"/>
-          <w:lang w:bidi="ar-SA"/>
-        </w:rPr>
-        <w:t>:  </w:t>
-      </w:r>
-      <w:r>
-        <w:rPr>
-          <w:rFonts w:cs="Times New Roman"/>
-          <w:lang w:bidi="ar-SA"/>
-        </w:rPr>
-        <w:t>{{topicTitle}}</w:t>
+        <w:t>...........................................................................................................................................................................................................................</w:t>
       </w:r>
     </w:p>
     <w:tbl>
@@ -228,12 +240,12 @@
         <w:tblLook w:val="0000" w:firstRow="0" w:lastRow="0" w:firstColumn="0" w:lastColumn="0" w:noHBand="0" w:noVBand="0"/>
       </w:tblPr>
       <w:tblGrid>
-        <w:gridCol w:w="1971"/>
-        <w:gridCol w:w="2393"/>
-        <w:gridCol w:w="2265"/>
-        <w:gridCol w:w="2397"/>
-        <w:gridCol w:w="2393"/>
-        <w:gridCol w:w="2197"/>
+        <w:gridCol w:w="2093"/>
+        <w:gridCol w:w="2551"/>
+        <w:gridCol w:w="2410"/>
+        <w:gridCol w:w="2552"/>
+        <w:gridCol w:w="2551"/>
+        <w:gridCol w:w="1459"/>
       </w:tblGrid>
       <w:tr>
         <w:trPr>
@@ -520,14 +532,6 @@
                 <w:rFonts w:cs="Times New Roman"/>
               </w:rPr>
             </w:pPr>
-            <w:r>
-              <w:rPr>
-                <w:rFonts w:cs="Times New Roman"/>
-                <w:b/>
-                <w:bCs/>
-              </w:rPr>
-              <w:t>{{diem1}}</w:t>
-            </w:r>
           </w:p>
         </w:tc>
       </w:tr>
@@ -835,36 +839,6 @@
                 <w:szCs w:val="20"/>
               </w:rPr>
             </w:pPr>
-            <w:r>
-              <w:rPr>
-                <w:rFonts w:cs="Times New Roman"/>
-                <w:b/>
-                <w:bCs/>
-                <w:sz w:val="20"/>
-                <w:szCs w:val="20"/>
-              </w:rPr>
-              <w:t>{{diem</w:t>
-            </w:r>
-            <w:r>
-              <w:rPr>
-                <w:rFonts w:cs="Times New Roman"/>
-                <w:b/>
-                <w:bCs/>
-                <w:sz w:val="20"/>
-                <w:szCs w:val="20"/>
-              </w:rPr>
-              <w:t>2</w:t>
-            </w:r>
-            <w:r>
-              <w:rPr>
-                <w:rFonts w:cs="Times New Roman"/>
-                <w:b/>
-                <w:bCs/>
-                <w:sz w:val="20"/>
-                <w:szCs w:val="20"/>
-              </w:rPr>
-              <w:t>}}</w:t>
-            </w:r>
           </w:p>
         </w:tc>
       </w:tr>
@@ -1164,36 +1138,6 @@
                 <w:szCs w:val="20"/>
               </w:rPr>
             </w:pPr>
-            <w:r>
-              <w:rPr>
-                <w:rFonts w:cs="Times New Roman"/>
-                <w:b/>
-                <w:bCs/>
-                <w:sz w:val="20"/>
-                <w:szCs w:val="20"/>
-              </w:rPr>
-              <w:t>{{diem</w:t>
-            </w:r>
-            <w:r>
-              <w:rPr>
-                <w:rFonts w:cs="Times New Roman"/>
-                <w:b/>
-                <w:bCs/>
-                <w:sz w:val="20"/>
-                <w:szCs w:val="20"/>
-              </w:rPr>
-              <w:t>3</w:t>
-            </w:r>
-            <w:r>
-              <w:rPr>
-                <w:rFonts w:cs="Times New Roman"/>
-                <w:b/>
-                <w:bCs/>
-                <w:sz w:val="20"/>
-                <w:szCs w:val="20"/>
-              </w:rPr>
-              <w:t>}}</w:t>
-            </w:r>
           </w:p>
         </w:tc>
       </w:tr>
@@ -1613,36 +1557,6 @@
                 <w:szCs w:val="20"/>
               </w:rPr>
             </w:pPr>
-            <w:r>
-              <w:rPr>
-                <w:rFonts w:cs="Times New Roman"/>
-                <w:b/>
-                <w:bCs/>
-                <w:sz w:val="20"/>
-                <w:szCs w:val="20"/>
-              </w:rPr>
-              <w:t>{{diem</w:t>
-            </w:r>
-            <w:r>
-              <w:rPr>
-                <w:rFonts w:cs="Times New Roman"/>
-                <w:b/>
-                <w:bCs/>
-                <w:sz w:val="20"/>
-                <w:szCs w:val="20"/>
-              </w:rPr>
-              <w:t>4</w:t>
-            </w:r>
-            <w:r>
-              <w:rPr>
-                <w:rFonts w:cs="Times New Roman"/>
-                <w:b/>
-                <w:bCs/>
-                <w:sz w:val="20"/>
-                <w:szCs w:val="20"/>
-              </w:rPr>
-              <w:t>}}</w:t>
-            </w:r>
           </w:p>
         </w:tc>
       </w:tr>
@@ -1916,12 +1830,6 @@
                 <w:rFonts w:cs="Times New Roman"/>
               </w:rPr>
             </w:pPr>
-            <w:r>
-              <w:rPr>
-                <w:rFonts w:cs="Times New Roman"/>
-              </w:rPr>
-              <w:t>{{totalScoreFixed}}</w:t>
-            </w:r>
           </w:p>
         </w:tc>
       </w:tr>
@@ -1970,21 +1878,21 @@
           <w:rFonts w:cs="Times New Roman"/>
           <w:lang w:bidi="ar-SA"/>
         </w:rPr>
-        <w:t>{{cho_bao_ve_mark}}</w:t>
+        <w:sym w:font="Wingdings" w:char="F0A8"/>
       </w:r>
       <w:r>
         <w:rPr>
           <w:rFonts w:cs="Times New Roman"/>
           <w:lang w:bidi="ar-SA"/>
         </w:rPr>
-        <w:t xml:space="preserve"> Cho SV bảo vệ trước hội đồng         </w:t>
+        <w:t xml:space="preserve"> Cho SV bảo vệ trước hội đồng            </w:t>
       </w:r>
       <w:r>
         <w:rPr>
           <w:rFonts w:cs="Times New Roman"/>
           <w:lang w:bidi="ar-SA"/>
         </w:rPr>
-        <w:t>{{khong_bao_ve_mark}}</w:t>
+        <w:sym w:font="Wingdings" w:char="F0A8"/>
       </w:r>
       <w:r>
         <w:rPr>
@@ -2007,7 +1915,7 @@
     <w:p>
       <w:pPr>
         <w:spacing w:before="100" w:beforeAutospacing="1" w:after="100" w:afterAutospacing="1"/>
-        <w:ind w:left="7920" w:firstLine="720"/>
+        <w:ind w:left="9720" w:firstLine="360"/>
         <w:rPr>
           <w:rFonts w:cs="Times New Roman"/>
           <w:lang w:bidi="ar-SA"/>
@@ -2018,7 +1926,7 @@
           <w:rFonts w:cs="Times New Roman"/>
           <w:lang w:bidi="ar-SA"/>
         </w:rPr>
-        <w:t>Ngày {{ngay}} tháng {{thang}} năm {{nam}}</w:t>
+        <w:t>Ngày ….tháng…..năm ……</w:t>
       </w:r>
     </w:p>
     <w:p>
@@ -2431,50 +2339,6 @@
     <w:lsdException w:name="Subtitle" w:qFormat="1"/>
     <w:lsdException w:name="Strong" w:qFormat="1"/>
     <w:lsdException w:name="Emphasis" w:qFormat="1"/>
-    <w:lsdException w:name="Normal Table" w:semiHidden="1" w:unhideWhenUsed="1"/>
-    <w:lsdException w:name="Table Simple 1" w:semiHidden="1" w:unhideWhenUsed="1"/>
-    <w:lsdException w:name="Table Simple 2" w:semiHidden="1" w:unhideWhenUsed="1"/>
-    <w:lsdException w:name="Table Simple 3" w:semiHidden="1" w:unhideWhenUsed="1"/>
-    <w:lsdException w:name="Table Classic 1" w:semiHidden="1" w:unhideWhenUsed="1"/>
-    <w:lsdException w:name="Table Classic 2" w:semiHidden="1" w:unhideWhenUsed="1"/>
-    <w:lsdException w:name="Table Classic 3" w:semiHidden="1" w:unhideWhenUsed="1"/>
-    <w:lsdException w:name="Table Classic 4" w:semiHidden="1" w:unhideWhenUsed="1"/>
-    <w:lsdException w:name="Table Colorful 1" w:semiHidden="1" w:unhideWhenUsed="1"/>
-    <w:lsdException w:name="Table Colorful 2" w:semiHidden="1" w:unhideWhenUsed="1"/>
-    <w:lsdException w:name="Table Colorful 3" w:semiHidden="1" w:unhideWhenUsed="1"/>
-    <w:lsdException w:name="Table Columns 1" w:semiHidden="1" w:unhideWhenUsed="1"/>
-    <w:lsdException w:name="Table Columns 2" w:semiHidden="1" w:unhideWhenUsed="1"/>
-    <w:lsdException w:name="Table Columns 3" w:semiHidden="1" w:unhideWhenUsed="1"/>
-    <w:lsdException w:name="Table Columns 4" w:semiHidden="1" w:unhideWhenUsed="1"/>
-    <w:lsdException w:name="Table Columns 5" w:semiHidden="1" w:unhideWhenUsed="1"/>
-    <w:lsdException w:name="Table Grid 1" w:semiHidden="1" w:unhideWhenUsed="1"/>
-    <w:lsdException w:name="Table Grid 2" w:semiHidden="1" w:unhideWhenUsed="1"/>
-    <w:lsdException w:name="Table Grid 3" w:semiHidden="1" w:unhideWhenUsed="1"/>
-    <w:lsdException w:name="Table Grid 4" w:semiHidden="1" w:unhideWhenUsed="1"/>
-    <w:lsdException w:name="Table Grid 5" w:semiHidden="1" w:unhideWhenUsed="1"/>
-    <w:lsdException w:name="Table Grid 6" w:semiHidden="1" w:unhideWhenUsed="1"/>
-    <w:lsdException w:name="Table Grid 7" w:semiHidden="1" w:unhideWhenUsed="1"/>
-    <w:lsdException w:name="Table Grid 8" w:semiHidden="1" w:unhideWhenUsed="1"/>
-    <w:lsdException w:name="Table List 1" w:semiHidden="1" w:unhideWhenUsed="1"/>
-    <w:lsdException w:name="Table List 2" w:semiHidden="1" w:unhideWhenUsed="1"/>
-    <w:lsdException w:name="Table List 3" w:semiHidden="1" w:unhideWhenUsed="1"/>
-    <w:lsdException w:name="Table List 4" w:semiHidden="1" w:unhideWhenUsed="1"/>
-    <w:lsdException w:name="Table List 5" w:semiHidden="1" w:unhideWhenUsed="1"/>
-    <w:lsdException w:name="Table List 6" w:semiHidden="1" w:unhideWhenUsed="1"/>
-    <w:lsdException w:name="Table List 7" w:semiHidden="1" w:unhideWhenUsed="1"/>
-    <w:lsdException w:name="Table List 8" w:semiHidden="1" w:unhideWhenUsed="1"/>
-    <w:lsdException w:name="Table 3D effects 1" w:semiHidden="1" w:unhideWhenUsed="1"/>
-    <w:lsdException w:name="Table 3D effects 2" w:semiHidden="1" w:unhideWhenUsed="1"/>
-    <w:lsdException w:name="Table 3D effects 3" w:semiHidden="1" w:unhideWhenUsed="1"/>
-    <w:lsdException w:name="Table Contemporary" w:semiHidden="1" w:unhideWhenUsed="1"/>
-    <w:lsdException w:name="Table Elegant" w:semiHidden="1" w:unhideWhenUsed="1"/>
-    <w:lsdException w:name="Table Professional" w:semiHidden="1" w:unhideWhenUsed="1"/>
-    <w:lsdException w:name="Table Subtle 1" w:semiHidden="1" w:unhideWhenUsed="1"/>
-    <w:lsdException w:name="Table Subtle 2" w:semiHidden="1" w:unhideWhenUsed="1"/>
-    <w:lsdException w:name="Table Web 1" w:semiHidden="1" w:unhideWhenUsed="1"/>
-    <w:lsdException w:name="Table Web 2" w:semiHidden="1" w:unhideWhenUsed="1"/>
-    <w:lsdException w:name="Table Web 3" w:semiHidden="1" w:unhideWhenUsed="1"/>
-    <w:lsdException w:name="Table Theme" w:semiHidden="1" w:unhideWhenUsed="1"/>
     <w:lsdException w:name="Placeholder Text" w:semiHidden="1" w:uiPriority="99"/>
     <w:lsdException w:name="No Spacing" w:uiPriority="1" w:qFormat="1"/>
     <w:lsdException w:name="Light Shading" w:uiPriority="60"/>
@@ -2708,14 +2572,11 @@
   </w:style>
   <w:style w:type="character" w:default="1" w:styleId="DefaultParagraphFont">
     <w:name w:val="Default Paragraph Font"/>
-    <w:uiPriority w:val="1"/>
-    <w:unhideWhenUsed/>
+    <w:semiHidden/>
   </w:style>
   <w:style w:type="table" w:default="1" w:styleId="TableNormal">
     <w:name w:val="Normal Table"/>
-    <w:uiPriority w:val="99"/>
     <w:semiHidden/>
-    <w:unhideWhenUsed/>
     <w:tblPr>
       <w:tblInd w:w="0" w:type="dxa"/>
       <w:tblCellMar>
@@ -2728,9 +2589,7 @@
   </w:style>
   <w:style w:type="numbering" w:default="1" w:styleId="NoList">
     <w:name w:val="No List"/>
-    <w:uiPriority w:val="99"/>
     <w:semiHidden/>
-    <w:unhideWhenUsed/>
   </w:style>
   <w:style w:type="table" w:styleId="TableGrid">
     <w:name w:val="Table Grid"/>

</xml_diff>